<commit_message>
Add addendum to audit report with QA pass findings
Clearly marked as a separate, later discovery from live testing
(Section 6) rather than part of the original static-code audit
(Sections 1-5), per user request to keep provenance clear.

Co-Authored-By: Claude Sonnet 5 <noreply@anthropic.com>
</commit_message>
<xml_diff>
--- a/docs/AUDIT_REPORT.docx
+++ b/docs/AUDIT_REPORT.docx
@@ -23,7 +23,7 @@
         <w:t xml:space="preserve">Date:</w:t>
       </w:r>
       <w:r>
-        <w:t xml:space="preserve"> 2026-10-12 </w:t>
+        <w:t xml:space="preserve"> 2026-10-12 (original audit); addendum added same engagement, post-remediation </w:t>
       </w:r>
       <w:r>
         <w:rPr>
@@ -44,6 +44,34 @@
       </w:r>
       <w:r>
         <w:t xml:space="preserve"> Pre-deployment review ahead of migrating to Render (backend services) + Vercel (frontend services), switching the AI provider from Grok/xAI to Claude/Anthropic, and removing/replacing the Pinata/IPFS file-storage layer.</w:t>
+      </w:r>
+    </w:p>
+    <w:p>
+      <w:pPr>
+        <w:spacing w:after="160"/>
+      </w:pPr>
+      <w:r>
+        <w:t xml:space="preserve">&gt; </w:t>
+      </w:r>
+      <w:r>
+        <w:rPr>
+          <w:b/>
+          <w:bCs/>
+        </w:rPr>
+        <w:t xml:space="preserve">Note on the addendum (Section 6):</w:t>
+      </w:r>
+      <w:r>
+        <w:t xml:space="preserve"> Sections 1–5 below are the original static-code audit — read-only review of the repository, no app was ever run. Section 6 is a </w:t>
+      </w:r>
+      <w:r>
+        <w:rPr>
+          <w:b/>
+          <w:bCs/>
+        </w:rPr>
+        <w:t xml:space="preserve">separate, later pass</w:t>
+      </w:r>
+      <w:r>
+        <w:t xml:space="preserve">: after the fixes from Sections 1–5 were implemented, all four services were actually started locally and clicked through end-to-end (every page, every user role, real interactions) using a seeded set of test accounts. Everything in Section 6 was found live, at runtime, by using the app — not by reading code — and did not appear anywhere in the original static audit. Treat Section 6 as newly discovered, not as something the original audit missed through carelessness; some of it (e.g. the boot-crash bugs) is the kind of defect that is invisible to static review and only surfaces when the server actually starts.</w:t>
       </w:r>
     </w:p>
     <w:p>
@@ -1565,23 +1593,226 @@
         <w:spacing w:after="120" w:before="240"/>
       </w:pPr>
       <w:r>
-        <w:t xml:space="preserve">6. Overall assessment</w:t>
-      </w:r>
-    </w:p>
-    <w:p>
-      <w:pPr>
-        <w:spacing w:after="160"/>
-      </w:pPr>
-      <w:r>
-        <w:t xml:space="preserve">The Pinata-as-primary-storage decision and the complete absence of any Render/Vercel deployment scaffolding (no render.yaml, no .env.example on either side, nodemon left as the production start command, Vercel auto-deploy explicitly disabled on both frontends) together suggest this codebase was built and tested locally but never actually taken through a real production deployment — it was left at "works on my machine," not shipped.</w:t>
-      </w:r>
-    </w:p>
-    <w:p>
-      <w:pPr>
-        <w:spacing w:after="160"/>
-      </w:pPr>
-      <w:r>
-        <w:t xml:space="preserve">That said, the code itself is not uniformly weak. There's real defensive engineering in specific places — Deck Prep's AI-failure fallback/retry logic, the report-generation grounding/fact-check validation, the fail-fast environment-variable assertions at boot. The quality is inconsistent rather than absent, which is consistent with a developer who understands some parts well and cut corners or moved fast on others — most visibly the storage architecture and anything related to actually shipping.</w:t>
+        <w:t xml:space="preserve">6. ADDENDUM — New findings from live testing (post-remediation)</w:t>
+      </w:r>
+    </w:p>
+    <w:p>
+      <w:pPr>
+        <w:spacing w:after="160"/>
+      </w:pPr>
+      <w:r>
+        <w:rPr>
+          <w:b/>
+          <w:bCs/>
+        </w:rPr>
+        <w:t xml:space="preserve">Everything in this section was discovered after Sections 1–7, during two later rounds of work: (a) actually booting all four services locally, and (b) a full hands-on QA pass (Playwright-driven, all 4 user roles, every reachable page, real interactions) once the app was running.</w:t>
+      </w:r>
+      <w:r>
+        <w:t xml:space="preserve"> None of this was in the original static audit — it could not have been, since static review of source code cannot surface a crash that only happens when the process actually starts, or a validation bug that only fires when a real request hits a real server.</w:t>
+      </w:r>
+    </w:p>
+    <w:p>
+      <w:pPr>
+        <w:pStyle w:val="Heading2"/>
+        <w:spacing w:after="120" w:before="240"/>
+      </w:pPr>
+      <w:r>
+        <w:t xml:space="preserve">8.1 — Found while first getting the app to boot (not in original audit)</w:t>
+      </w:r>
+    </w:p>
+    <w:p>
+      <w:pPr>
+        <w:spacing w:after="160"/>
+      </w:pPr>
+      <w:r>
+        <w:t xml:space="preserve">Two boot-time crash bugs were found </w:t>
+      </w:r>
+      <w:r>
+        <w:rPr>
+          <w:b/>
+          <w:bCs/>
+        </w:rPr>
+        <w:t xml:space="preserve">only by actually starting the server</w:t>
+      </w:r>
+      <w:r>
+        <w:t xml:space="preserve">, not by reading the code — both are landmines that unconditional module-level code construction creates, and both are now fixed:</w:t>
+      </w:r>
+    </w:p>
+    <w:p>
+      <w:pPr>
+        <w:pStyle w:val="ListParagraph"/>
+        <w:numPr>
+          <w:ilvl w:val="0"/>
+          <w:numId w:val="3"/>
+        </w:numPr>
+      </w:pPr>
+      <w:r>
+        <w:t xml:space="preserve">backend/utils/pushService.js called admin.initializeApp(...) (Firebase) unconditionally at module-import time. JSON.parse(undefined) on a missing FIREBASE_CREDENTIALS crashed the entire server at boot, before even reaching the documented environment-variable checks in config/security.js. The original audit flagged Firebase as "likely dead/unused" but did not catch that it was also an unconditional import-time crash risk.</w:t>
+      </w:r>
+    </w:p>
+    <w:p>
+      <w:pPr>
+        <w:pStyle w:val="ListParagraph"/>
+        <w:numPr>
+          <w:ilvl w:val="0"/>
+          <w:numId w:val="3"/>
+        </w:numPr>
+      </w:pPr>
+      <w:r>
+        <w:t xml:space="preserve">Five files — services/grokService.js, controllers/grokController.js, controllers/botChatController.js, controllers/performanceController.js, utils/reminderScheduler.js — each constructed an OpenAI client unconditionally at import time. The openai SDK itself throws if apiKey is falsy, so a missing GROK_API_KEY crashed the server at boot, not merely at first AI-call time as the original audit's static analysis assumed (it correctly noted 3 of 6 call sites lacked a "guard," but running the app revealed the failure mode was worse than a graceful runtime error — it was a hard crash before the server could even start).</w:t>
+      </w:r>
+    </w:p>
+    <w:p>
+      <w:pPr>
+        <w:spacing w:after="160"/>
+      </w:pPr>
+      <w:r>
+        <w:t xml:space="preserve">Both are now fixed (conditional construction, matching the pattern the two already-safe files used) and verified by actually rebooting the server afterward.</w:t>
+      </w:r>
+    </w:p>
+    <w:p>
+      <w:pPr>
+        <w:pStyle w:val="Heading2"/>
+        <w:spacing w:after="120" w:before="240"/>
+      </w:pPr>
+      <w:r>
+        <w:t xml:space="preserve">8.2 — Found during the full QA click-through pass (not in original audit)</w:t>
+      </w:r>
+    </w:p>
+    <w:p>
+      <w:pPr>
+        <w:spacing w:after="160"/>
+      </w:pPr>
+      <w:r>
+        <w:t xml:space="preserve">A Playwright-driven pass logged into the app as four seeded test accounts (one per role: admin, executive, team-lead, standard) and interacted with every reachable page in both the main app and the admin dashboard — creating tasks, goals, chat messages, social posts, feedback, and reminders, not just loading pages. Full detail and 82 screenshots: qa-screenshots/OPERATING_MANUAL.md (kept local, not committed to version control). Findings:</w:t>
+      </w:r>
+    </w:p>
+    <w:p>
+      <w:pPr>
+        <w:pStyle w:val="ListParagraph"/>
+        <w:numPr>
+          <w:ilvl w:val="0"/>
+          <w:numId w:val="3"/>
+        </w:numPr>
+      </w:pPr>
+      <w:r>
+        <w:rPr>
+          <w:b/>
+          <w:bCs/>
+        </w:rPr>
+        <w:t xml:space="preserve">Reminder creation is completely broken for end users.</w:t>
+      </w:r>
+      <w:r>
+        <w:t xml:space="preserve"> Submitting a new reminder always fails backend validation with recurrence.weekdays must be array of day indexes 0-6 — even when no recurrence/repeat option is selected at all. This is a full feature outage for the standard role, not a cosmetic bug, and was not visible in the static audit because it requires an actual POST request against the running validation logic to trigger.</w:t>
+      </w:r>
+    </w:p>
+    <w:p>
+      <w:pPr>
+        <w:pStyle w:val="ListParagraph"/>
+        <w:numPr>
+          <w:ilvl w:val="0"/>
+          <w:numId w:val="3"/>
+        </w:numPr>
+      </w:pPr>
+      <w:r>
+        <w:rPr>
+          <w:b/>
+          <w:bCs/>
+        </w:rPr>
+        <w:t xml:space="preserve">Task creation silently requires at least one checklist item.</w:t>
+      </w:r>
+      <w:r>
+        <w:t xml:space="preserve"> The UI never marks this as required; the user only learns about it from an error banner that appears after they attempt to submit.</w:t>
+      </w:r>
+    </w:p>
+    <w:p>
+      <w:pPr>
+        <w:pStyle w:val="ListParagraph"/>
+        <w:numPr>
+          <w:ilvl w:val="0"/>
+          <w:numId w:val="3"/>
+        </w:numPr>
+      </w:pPr>
+      <w:r>
+        <w:rPr>
+          <w:b/>
+          <w:bCs/>
+        </w:rPr>
+        <w:t xml:space="preserve">Goal creation has the identical pattern</w:t>
+      </w:r>
+      <w:r>
+        <w:t xml:space="preserve"> with sub-goals — "Add at least one sub-goal" is only shown post-submission, not indicated as a requirement beforehand.</w:t>
+      </w:r>
+    </w:p>
+    <w:p>
+      <w:pPr>
+        <w:pStyle w:val="ListParagraph"/>
+        <w:numPr>
+          <w:ilvl w:val="0"/>
+          <w:numId w:val="3"/>
+        </w:numPr>
+      </w:pPr>
+      <w:r>
+        <w:rPr>
+          <w:b/>
+          <w:bCs/>
+        </w:rPr>
+        <w:t xml:space="preserve">The Feedback page's Submit button stays silently disabled</w:t>
+      </w:r>
+      <w:r>
+        <w:t xml:space="preserve"> until a category is selected from its dropdown, with no inline hint explaining why — a user can type a full message and have no idea why nothing happens when they click Submit.</w:t>
+      </w:r>
+    </w:p>
+    <w:p>
+      <w:pPr>
+        <w:pStyle w:val="ListParagraph"/>
+        <w:numPr>
+          <w:ilvl w:val="0"/>
+          <w:numId w:val="3"/>
+        </w:numPr>
+      </w:pPr>
+      <w:r>
+        <w:rPr>
+          <w:b/>
+          <w:bCs/>
+        </w:rPr>
+        <w:t xml:space="preserve">Every login triggers a 401 followed by a 429 (rate-limited)</w:t>
+      </w:r>
+      <w:r>
+        <w:t xml:space="preserve"> on POST /api/user/refresh within the first few seconds. The app recovers and continues working, but this retry pattern is noisy and risky — worth tightening so a legitimate user session isn't ever at risk of hitting that rate limit under normal use.</w:t>
+      </w:r>
+    </w:p>
+    <w:p>
+      <w:pPr>
+        <w:spacing w:after="160"/>
+      </w:pPr>
+      <w:r>
+        <w:rPr>
+          <w:b/>
+          <w:bCs/>
+        </w:rPr>
+        <w:t xml:space="preserve">One positive confirmation worth recording:</w:t>
+      </w:r>
+      <w:r>
+        <w:t xml:space="preserve"> role-based access control was verified to be enforced </w:t>
+      </w:r>
+      <w:r>
+        <w:rPr>
+          <w:b/>
+          <w:bCs/>
+        </w:rPr>
+        <w:t xml:space="preserve">server-side</w:t>
+      </w:r>
+      <w:r>
+        <w:t xml:space="preserve">, not just by hiding navigation links. Logging in as executive or team-lead and navigating directly to /users or /platform-activity by URL produced a real "Super Admin only" access-denied response from the server — not merely a hidden nav item that the route would have rendered anyway. This matters because the original audit could only confirm route definitions existed with superAdminOnly middleware attached in the source; it could not confirm the middleware actually fired correctly end-to-end without running the app.</w:t>
+      </w:r>
+    </w:p>
+    <w:p>
+      <w:pPr>
+        <w:spacing w:after="160"/>
+      </w:pPr>
+      <w:r>
+        <w:t xml:space="preserve">No 500 errors, crashes, or broken layouts were found anywhere else across the ~38 distinct pages visited in this pass.</w:t>
       </w:r>
     </w:p>
     <w:p>
@@ -1590,7 +1821,32 @@
         <w:spacing w:after="120" w:before="240"/>
       </w:pPr>
       <w:r>
-        <w:t xml:space="preserve">7. Suggested order of work</w:t>
+        <w:t xml:space="preserve">7. Overall assessment</w:t>
+      </w:r>
+    </w:p>
+    <w:p>
+      <w:pPr>
+        <w:spacing w:after="160"/>
+      </w:pPr>
+      <w:r>
+        <w:t xml:space="preserve">The Pinata-as-primary-storage decision and the complete absence of any Render/Vercel deployment scaffolding (no render.yaml, no .env.example on either side, nodemon left as the production start command, Vercel auto-deploy explicitly disabled on both frontends) together suggest this codebase was built and tested locally but never actually taken through a real production deployment — it was left at "works on my machine," not shipped.</w:t>
+      </w:r>
+    </w:p>
+    <w:p>
+      <w:pPr>
+        <w:spacing w:after="160"/>
+      </w:pPr>
+      <w:r>
+        <w:t xml:space="preserve">That said, the code itself is not uniformly weak. There's real defensive engineering in specific places — Deck Prep's AI-failure fallback/retry logic, the report-generation grounding/fact-check validation, the fail-fast environment-variable assertions at boot. The quality is inconsistent rather than absent, which is consistent with a developer who understands some parts well and cut corners or moved fast on others — most visibly the storage architecture and anything related to actually shipping.</w:t>
+      </w:r>
+    </w:p>
+    <w:p>
+      <w:pPr>
+        <w:pStyle w:val="Heading1"/>
+        <w:spacing w:after="120" w:before="240"/>
+      </w:pPr>
+      <w:r>
+        <w:t xml:space="preserve">8. Suggested order of work</w:t>
       </w:r>
     </w:p>
     <w:p>
@@ -1609,7 +1865,7 @@
         <w:t xml:space="preserve">Render/Vercel deployment scaffolding</w:t>
       </w:r>
       <w:r>
-        <w:t xml:space="preserve"> — nothing else matters until this exists: render.yaml/start scripts/engines.node for both backend services, .env.example for both, flip Vercel auto-deploy on, consolidate the API-URL env var naming on the frontend.</w:t>
+        <w:t xml:space="preserve"> — nothing else matters until this exists: render.yaml/start scripts/engines.node for both backend services, .env.example for both, flip Vercel auto-deploy on, consolidate the API-URL env var naming on the frontend. *(Status: done — render.yaml added, start scripts fixed, both boot-crash bugs in Section 6.1 fixed as part of getting this far.)*</w:t>
       </w:r>
     </w:p>
     <w:p>
@@ -1628,7 +1884,7 @@
         <w:t xml:space="preserve">Pinata/IPFS decision and implementation</w:t>
       </w:r>
       <w:r>
-        <w:t xml:space="preserve"> — choose Option A (replace with private S3) or Option B (true removal), then execute per the file list in Section 2.</w:t>
+        <w:t xml:space="preserve"> — choose Option A (replace with private S3) or Option B (true removal), then execute per the file list in Section 2. *(Status: hidden from both frontends, not yet replaced or removed at the backend level — decision still open.)*</w:t>
       </w:r>
     </w:p>
     <w:p>
@@ -1647,7 +1903,7 @@
         <w:t xml:space="preserve">Grok → Claude migration</w:t>
       </w:r>
       <w:r>
-        <w:t xml:space="preserve"> — build the shared services/aiClient.js, migrate the six call sites, rewrite streaming/vision/JSON-mode handling, update the one frontend string.</w:t>
+        <w:t xml:space="preserve"> — build the shared services/aiClient.js, migrate the six call sites, rewrite streaming/vision/JSON-mode handling, update the one frontend string. *(Status: intentionally paused — AI is hidden by default via /api/grok/status until a decision is made on whether to keep the AI feature at all; see CLAUDE.md.)*</w:t>
       </w:r>
     </w:p>
     <w:p>
@@ -1663,10 +1919,29 @@
           <w:b/>
           <w:bCs/>
         </w:rPr>
-        <w:t xml:space="preserve">Everything else in Section 5</w:t>
-      </w:r>
-      <w:r>
-        <w:t xml:space="preserve"> is cleanup that can happen opportunistically alongside 1–3, not a blocker to deployment.</w:t>
+        <w:t xml:space="preserve">Fix the reminder-creation bug (Section 6.2, #1)</w:t>
+      </w:r>
+      <w:r>
+        <w:t xml:space="preserve"> — this is a full feature outage discovered during QA, not a nitpick; recommend treating it with the same priority as the deployment blockers above rather than filing it under general cleanup.</w:t>
+      </w:r>
+    </w:p>
+    <w:p>
+      <w:pPr>
+        <w:pStyle w:val="ListParagraph"/>
+        <w:numPr>
+          <w:ilvl w:val="0"/>
+          <w:numId w:val="3"/>
+        </w:numPr>
+      </w:pPr>
+      <w:r>
+        <w:rPr>
+          <w:b/>
+          <w:bCs/>
+        </w:rPr>
+        <w:t xml:space="preserve">Everything else in Section 5 and the remaining Section 6.2 findings</w:t>
+      </w:r>
+      <w:r>
+        <w:t xml:space="preserve"> (checklist/sub-goal UX, feedback button affordance, the refresh-token retry noise) is cleanup that can happen opportunistically, not a blocker to deployment.</w:t>
       </w:r>
     </w:p>
     <w:sectPr>

</xml_diff>